<commit_message>
Final submission: AuraFit Evolutionary Engine v1.0. Complete with SQLite migration and documentation.
</commit_message>
<xml_diff>
--- a/docs/proposal.docx
+++ b/docs/proposal.docx
@@ -55,7 +55,7 @@
           <w:rFonts w:ascii="Times New Roman" w:hAnsi="Times New Roman" w:cs="Times New Roman"/>
         </w:rPr>
         <w:pict w14:anchorId="169B5ED7">
-          <v:rect id="_x0000_i1025" style="width:0;height:1.5pt" o:hralign="center" o:hrstd="t" o:hr="t" fillcolor="#a0a0a0" stroked="f"/>
+          <v:rect id="_x0000_i1026" style="width:0;height:1.5pt" o:hralign="center" o:hrstd="t" o:hr="t" fillcolor="#a0a0a0" stroked="f"/>
         </w:pict>
       </w:r>
     </w:p>
@@ -76,16 +76,44 @@
     </w:p>
     <w:p>
       <w:r>
-        <w:t>Designing effective weekly training programs requires balancing multiple competing factors, including exercise selection, fatigue management, time constraints, recovery requirements, and user-specific goals. In practice, these decisions are often made heuristically rather than through formal optimization methods. This project formulates workout planning as a constrained scheduling problem and proposes a hybrid two-phase approach: a greedy heuristic algorithm to construct feasible baseline plans, followed by a local search refinement to optimize workload distribution. The system integrates hard constraints such as session duration and fatigue limits with soft optimization criteria including movement coverage, exercise priority, and goal alignment. A random feasible baseline is implemented for comparison. Preliminary results demonstrate that the approach produces structured, constraint-compliant schedules while exposing tradeoffs in workload balance and session utilization. This work establishes a foundation for further optimization and analysis in subsequent project phases.</w:t>
+        <w:t xml:space="preserve">Designing effective weekly training programs requires balancing multiple competing factors, including exercise selection, fatigue management, time constraints, recovery requirements, and user-specific goals. In practice, these decisions are often made heuristically rather than through formal optimization methods. This project proposes </w:t>
       </w:r>
-    </w:p>
-    <w:p>
+      <w:r>
+        <w:rPr>
+          <w:b/>
+          <w:bCs/>
+        </w:rPr>
+        <w:t>AuraFit</w:t>
+      </w:r>
+      <w:r>
+        <w:t xml:space="preserve">, a system that formulates workout planning as a constrained scheduling problem solved via </w:t>
+      </w:r>
+      <w:r>
+        <w:rPr>
+          <w:b/>
+          <w:bCs/>
+        </w:rPr>
+        <w:t>Evolutionary Computation</w:t>
+      </w:r>
+      <w:r>
+        <w:t xml:space="preserve">. AuraFit utilizes a </w:t>
+      </w:r>
+      <w:r>
+        <w:rPr>
+          <w:b/>
+          <w:bCs/>
+        </w:rPr>
+        <w:t>Genetic Algorithm (GA)</w:t>
+      </w:r>
+      <w:r>
+        <w:t xml:space="preserve"> to navigate the high-dimensional search space, ensuring global optimization where traditional greedy methods fail. The system integrates hard constraints, such as session duration and fatigue limits, with multi-objective fitness criteria, including movement taxonomy coverage and workload variance minimization. Results demonstrate that this evolutionary approach produces superior, constraint-compliant schedules by eliminating "look-ahead blindness" common in sequential scheduling.</w:t>
+      </w:r>
       <w:r>
         <w:rPr>
           <w:rFonts w:ascii="Times New Roman" w:hAnsi="Times New Roman" w:cs="Times New Roman"/>
         </w:rPr>
         <w:pict w14:anchorId="15CDBEDD">
-          <v:rect id="_x0000_i1026" style="width:0;height:1.5pt" o:hralign="center" o:hrstd="t" o:hr="t" fillcolor="#a0a0a0" stroked="f"/>
+          <v:rect id="_x0000_i1027" style="width:0;height:1.5pt" o:hralign="center" o:hrstd="t" o:hr="t" fillcolor="#a0a0a0" stroked="f"/>
         </w:pict>
       </w:r>
     </w:p>
@@ -111,11 +139,11 @@
     </w:p>
     <w:p>
       <w:r>
-        <w:t xml:space="preserve">In this project, weekly workout planning is modeled as a constrained optimization problem in which exercises must be assigned to training sessions under strict feasibility requirements. These include session duration limits, fatigue capacity, equipment availability, and inter-session recovery constraints. Fatigue is modeled as a bounded </w:t>
+        <w:t xml:space="preserve">In this project, weekly workout planning is modeled as a constrained optimization problem in which exercises must be assigned to training sessions under strict feasibility requirements. These include session duration limits, fatigue capacity, equipment availability, and inter-session recovery constraints. Fatigue is modeled as a bounded resource, reflecting well-established concepts of training load (Impellizzeri et al., 2005; </w:t>
       </w:r>
       <w:r>
         <w:lastRenderedPageBreak/>
-        <w:t>resource, reflecting well-established concepts of training load (Impellizzeri et al., 2005; Zatsiorsky &amp; Kraemer, 2006). Additionally, the system must satisfy higher-level objectives such as movement category coverage and alignment with user-specific goals, consistent with research on training frequency and adaptation (Schoenfeld et al., 2016). The system must operate efficiently under bounded computational complexity, producing schedules in near real-time while maintaining correctness under strict feasibility constraints.</w:t>
+        <w:t>Zatsiorsky &amp; Kraemer, 2006). Additionally, the system must satisfy higher-level objectives such as movement category coverage and alignment with user-specific goals, consistent with research on training frequency and adaptation (Schoenfeld et al., 2016). The system must operate efficiently under bounded computational complexity, producing schedules in near real-time while maintaining correctness under strict feasibility constraints.</w:t>
       </w:r>
     </w:p>
     <w:p>
@@ -124,7 +152,7 @@
           <w:rFonts w:ascii="Times New Roman" w:hAnsi="Times New Roman" w:cs="Times New Roman"/>
         </w:rPr>
         <w:pict w14:anchorId="2D2D89CC">
-          <v:rect id="_x0000_i1030" style="width:0;height:1.5pt" o:hralign="center" o:hrstd="t" o:hr="t" fillcolor="#a0a0a0" stroked="f"/>
+          <v:rect id="_x0000_i1028" style="width:0;height:1.5pt" o:hralign="center" o:hrstd="t" o:hr="t" fillcolor="#a0a0a0" stroked="f"/>
         </w:pict>
       </w:r>
     </w:p>
@@ -150,6 +178,14 @@
     </w:p>
     <w:p>
       <w:r>
+        <w:t>The problem of scheduling under constraints has been extensively studied in areas such as combinatorial optimization and job scheduling. Classical approaches include greedy algorithms and dynamic programming. Greedy algorithms provide efficient approximations but often fall into local optima</w:t>
+      </w:r>
+      <w:r>
+        <w:t>.</w:t>
+      </w:r>
+    </w:p>
+    <w:p>
+      <w:r>
         <w:t>In industry, similar principles are applied in large-scale systems such as recommendation engines, infrastructure scheduling, and logistics planning (Beyer et al., 2016; Gomez-Uribe &amp; Hunt, 2015). These systems often rely on heuristic methods due to scalability constraints. However, existing approaches typically assume abstract task structures and do not incorporate domain-specific considerations such as fatigue accumulation or recovery constraints. This project addresses that gap by embedding domain-informed constraints into a scheduling framework.</w:t>
       </w:r>
     </w:p>
@@ -159,7 +195,7 @@
           <w:rFonts w:ascii="Times New Roman" w:hAnsi="Times New Roman" w:cs="Times New Roman"/>
         </w:rPr>
         <w:pict w14:anchorId="2ACA2352">
-          <v:rect id="_x0000_i1031" style="width:0;height:1.5pt" o:hralign="center" o:hrstd="t" o:hr="t" fillcolor="#a0a0a0" stroked="f"/>
+          <v:rect id="_x0000_i1029" style="width:0;height:1.5pt" o:hralign="center" o:hrstd="t" o:hr="t" fillcolor="#a0a0a0" stroked="f"/>
         </w:pict>
       </w:r>
     </w:p>
@@ -217,6 +253,7 @@
     </w:p>
     <w:p>
       <w:r>
+        <w:lastRenderedPageBreak/>
         <w:t>This layered approach ensures that all generated plans satisfy strict constraints while prioritizing high-quality selections through heuristic scoring and subsequent refinement.</w:t>
       </w:r>
     </w:p>
@@ -225,9 +262,8 @@
         <w:rPr>
           <w:rFonts w:ascii="Times New Roman" w:hAnsi="Times New Roman" w:cs="Times New Roman"/>
         </w:rPr>
-        <w:lastRenderedPageBreak/>
         <w:pict w14:anchorId="1EA612E5">
-          <v:rect id="_x0000_i1032" style="width:0;height:1.5pt" o:hralign="center" o:hrstd="t" o:hr="t" fillcolor="#a0a0a0" stroked="f"/>
+          <v:rect id="_x0000_i1030" style="width:0;height:1.5pt" o:hralign="center" o:hrstd="t" o:hr="t" fillcolor="#a0a0a0" stroked="f"/>
         </w:pict>
       </w:r>
     </w:p>
@@ -248,7 +284,38 @@
     </w:p>
     <w:p>
       <w:r>
-        <w:t>The core algorithm follows a greedy construction strategy. For each training day, the system iteratively evaluates all feasible exercises and selects the one with the highest heuristic score. The session state is updated after each selection, and the process continues until no additional exercises can be added without violating constraints. The time complexity of this construction phase is O(D x N x K), where D represents the number of training days, N represents the number of exercises, and K represents the number of selections per session. This results in linear scaling with respect to dataset size, making the approach efficient for moderate problem sizes. Following construction, the local search refinement iterates over neighborhood configurations (swaps, insertions) to minimize fatigue variance. Memory usage is similarly efficient, requiring only storage of exercise data, session states, and auxiliary tracking structures such as assigned exercises and category history.</w:t>
+        <w:t xml:space="preserve">The core algorithm follows an evolutionary pipeline. The time complexity of this search is </w:t>
+      </w:r>
+      <w:r>
+        <w:t>O (</w:t>
+      </w:r>
+      <w:r>
+        <w:t xml:space="preserve">G </w:t>
+      </w:r>
+      <w:r>
+        <w:t>x</w:t>
+      </w:r>
+      <w:r>
+        <w:t xml:space="preserve"> P </w:t>
+      </w:r>
+      <w:r>
+        <w:t>x</w:t>
+      </w:r>
+      <w:r>
+        <w:t xml:space="preserve"> E) where G represents total generations, P represents population size, and E represents the cost of the fitness evaluation. This results in linear scaling relative to population growth, ensuring efficiency for moderate-to-large exercise datasets. </w:t>
+      </w:r>
+    </w:p>
+    <w:p>
+      <w:proofErr w:type="gramStart"/>
+      <w:r>
+        <w:t xml:space="preserve">The </w:t>
+      </w:r>
+      <w:r>
+        <w:t>GA</w:t>
+      </w:r>
+      <w:proofErr w:type="gramEnd"/>
+      <w:r>
+        <w:t xml:space="preserve"> iterates over generations, using Elitism to preserve the top 5% of individuals while crossover swaps "training blocks" to preserve temporal recovery patterns. Memory usage remains efficient, requiring only the storage of current and next-generation populations alongside exercise metadata. </w:t>
       </w:r>
     </w:p>
     <w:p>
@@ -263,7 +330,7 @@
           <w:rFonts w:ascii="Times New Roman" w:hAnsi="Times New Roman" w:cs="Times New Roman"/>
         </w:rPr>
         <w:pict w14:anchorId="280A873E">
-          <v:rect id="_x0000_i1027" style="width:0;height:1.5pt" o:hralign="center" o:hrstd="t" o:hr="t" fillcolor="#a0a0a0" stroked="f"/>
+          <v:rect id="_x0000_i1031" style="width:0;height:1.5pt" o:hralign="center" o:hrstd="t" o:hr="t" fillcolor="#a0a0a0" stroked="f"/>
         </w:pict>
       </w:r>
     </w:p>
@@ -279,12 +346,12 @@
           <w:b/>
           <w:bCs/>
         </w:rPr>
-        <w:t>Greedy Design Rationale</w:t>
+        <w:t>Evolutionary Design Rationale</w:t>
       </w:r>
     </w:p>
     <w:p>
       <w:r>
-        <w:t>The greedy approach is chosen due to the combinatorial complexity of the scheduling problem. Exact optimization methods such as dynamic programming are impractical due to the interaction of multiple constraints. By selecting locally optimal choices, the system efficiently constructs valid baseline schedules. While this does not guarantee global optimality on its own, it produces strong practical results and aligns with established approximation methods in scheduling theory (Kleinberg &amp; Tardos, 2006). The subsequent local search phase bridges the gap between local and global optimality by smoothing out the fatigue load.</w:t>
+        <w:t>A Genetic Algorithm was chosen to address the combinatorial complexity and myopic nature of greedy heuristics. While greedy systems select locally optimal choices, they cannot guarantee global optimality and often front-load the training week. By evaluating the entire 7-day microcycle simultaneously, AuraFit bridges the gap between local and global optimality, flattening the fatigue curve and balancing the workload</w:t>
       </w:r>
     </w:p>
     <w:p>
@@ -293,7 +360,7 @@
           <w:rFonts w:ascii="Times New Roman" w:hAnsi="Times New Roman" w:cs="Times New Roman"/>
         </w:rPr>
         <w:pict w14:anchorId="5F1B096E">
-          <v:rect id="_x0000_i1028" style="width:0;height:1.5pt" o:hralign="center" o:hrstd="t" o:hr="t" fillcolor="#a0a0a0" stroked="f"/>
+          <v:rect id="_x0000_i1032" style="width:0;height:1.5pt" o:hralign="center" o:hrstd="t" o:hr="t" fillcolor="#a0a0a0" stroked="f"/>
         </w:pict>
       </w:r>
     </w:p>
@@ -309,73 +376,56 @@
           <w:b/>
           <w:bCs/>
         </w:rPr>
-        <w:t>Heuristic Scoring Function</w:t>
+        <w:t>Fitness Scoring Function</w:t>
       </w:r>
     </w:p>
     <w:p>
       <w:r>
-        <w:t>The scoring function evaluates candidate exercises based on multiple factors:</w:t>
+        <w:t xml:space="preserve">The fitness judge evaluates candidates based on a weighted sum of factors: </w:t>
       </w:r>
     </w:p>
     <w:p>
       <w:pPr>
-        <w:pStyle w:val="ListBullet"/>
+        <w:numPr>
+          <w:ilvl w:val="0"/>
+          <w:numId w:val="10"/>
+        </w:numPr>
       </w:pPr>
       <w:r>
-        <w:t>• exercise priority</w:t>
+        <w:t xml:space="preserve">Exercise Priority &amp; Goal Alignment </w:t>
       </w:r>
     </w:p>
     <w:p>
       <w:pPr>
-        <w:pStyle w:val="ListBullet"/>
+        <w:numPr>
+          <w:ilvl w:val="0"/>
+          <w:numId w:val="10"/>
+        </w:numPr>
       </w:pPr>
       <w:r>
-        <w:t>• category coverage</w:t>
+        <w:t xml:space="preserve">Taxonomy Coverage (9 core movement categories) </w:t>
       </w:r>
     </w:p>
     <w:p>
       <w:pPr>
-        <w:pStyle w:val="ListBullet"/>
+        <w:numPr>
+          <w:ilvl w:val="0"/>
+          <w:numId w:val="10"/>
+        </w:numPr>
       </w:pPr>
       <w:r>
-        <w:t>• goal alignment</w:t>
+        <w:t xml:space="preserve">Session Density Reward (Preventing "Lazy AI" strategies) </w:t>
       </w:r>
     </w:p>
     <w:p>
       <w:pPr>
-        <w:pStyle w:val="ListBullet"/>
+        <w:numPr>
+          <w:ilvl w:val="0"/>
+          <w:numId w:val="10"/>
+        </w:numPr>
       </w:pPr>
       <w:r>
-        <w:t>• user preferences</w:t>
-      </w:r>
-    </w:p>
-    <w:p>
-      <w:pPr>
-        <w:pStyle w:val="ListBullet"/>
-      </w:pPr>
-      <w:r>
-        <w:t>• time fit</w:t>
-      </w:r>
-    </w:p>
-    <w:p>
-      <w:pPr>
-        <w:pStyle w:val="ListBullet"/>
-      </w:pPr>
-      <w:r>
-        <w:t>• fatigue penalty</w:t>
-      </w:r>
-    </w:p>
-    <w:p>
-      <w:r>
-        <w:t xml:space="preserve">These components are combined into a weighted sum, guiding the greedy selection process. The scoring system reflects domain-informed priorities and </w:t>
-      </w:r>
-      <w:proofErr w:type="gramStart"/>
-      <w:r>
-        <w:t>approximates</w:t>
-      </w:r>
-      <w:proofErr w:type="gramEnd"/>
-      <w:r>
-        <w:t xml:space="preserve"> long-term value through local decisions.</w:t>
+        <w:t xml:space="preserve">Fatigue &amp; Overlap Penalties </w:t>
       </w:r>
     </w:p>
     <w:p>
@@ -383,9 +433,8 @@
         <w:rPr>
           <w:rFonts w:ascii="Times New Roman" w:hAnsi="Times New Roman" w:cs="Times New Roman"/>
         </w:rPr>
-        <w:lastRenderedPageBreak/>
         <w:pict w14:anchorId="026DD884">
-          <v:rect id="_x0000_i1029" style="width:0;height:1.5pt" o:hralign="center" o:hrstd="t" o:hr="t" fillcolor="#a0a0a0" stroked="f"/>
+          <v:rect id="_x0000_i1033" style="width:0;height:1.5pt" o:hralign="center" o:hrstd="t" o:hr="t" fillcolor="#a0a0a0" stroked="f"/>
         </w:pict>
       </w:r>
     </w:p>
@@ -406,7 +455,11 @@
     </w:p>
     <w:p>
       <w:r>
-        <w:t>A key aspect of this project is the translation of domain-specific training principles into formal computational constraints. Exercises are modeled as structured entities with attributes influencing feasibility and desirability. Fatigue is treated as a bounded resource within each session, ensuring workload remains within manageable limits (Impellizzeri et al., 2005). Recovery constraints enforce a 48-to-72 hour spacing between similar movement categories to allow for central nervous system and muscle protein synthesis repair (Haff &amp; Triplett, 2015), preventing excessive repetition and reflecting real-world training practices (Zatsiorsky &amp; Kraemer, 2006). Category coverage ensures structural completeness across the week, aligning with research emphasizing the importance of balanced training frequency (Schoenfeld et al., 2016).</w:t>
+        <w:t xml:space="preserve">A key aspect of this project is the translation of domain-specific training principles into formal computational constraints. Exercises are modeled as structured entities with attributes influencing feasibility and desirability. Fatigue is treated as a bounded resource within each session, ensuring workload remains within manageable limits </w:t>
+      </w:r>
+      <w:r>
+        <w:lastRenderedPageBreak/>
+        <w:t>(Impellizzeri et al., 2005). Recovery constraints enforce a 48-to-72 hour spacing between similar movement categories to allow for central nervous system and muscle protein synthesis repair (Haff &amp; Triplett, 2015), preventing excessive repetition and reflecting real-world training practices (Zatsiorsky &amp; Kraemer, 2006). Category coverage ensures structural completeness across the week, aligning with research emphasizing the importance of balanced training frequency (Schoenfeld et al., 2016).</w:t>
       </w:r>
     </w:p>
     <w:p>
@@ -415,7 +468,7 @@
           <w:rFonts w:ascii="Times New Roman" w:hAnsi="Times New Roman" w:cs="Times New Roman"/>
         </w:rPr>
         <w:pict w14:anchorId="46E41F13">
-          <v:rect id="_x0000_i1033" style="width:0;height:1.5pt" o:hralign="center" o:hrstd="t" o:hr="t" fillcolor="#a0a0a0" stroked="f"/>
+          <v:rect id="_x0000_i1034" style="width:0;height:1.5pt" o:hralign="center" o:hrstd="t" o:hr="t" fillcolor="#a0a0a0" stroked="f"/>
         </w:pict>
       </w:r>
     </w:p>
@@ -441,7 +494,10 @@
     </w:p>
     <w:p>
       <w:r>
-        <w:t>Input JSON -&gt; Loader -&gt; Models -&gt; Filters -&gt; Scoring -&gt; Scheduler (Greedy + Refinement) -&gt; Evaluator -&gt; Output</w:t>
+        <w:t>Input (JSON/SQLite) -&gt; Models -&gt; GA Engine (Selection/Breeding) -&gt; Evaluator -&gt; Final Plan</w:t>
+      </w:r>
+      <w:r>
+        <w:t xml:space="preserve"> </w:t>
       </w:r>
     </w:p>
     <w:p>
@@ -455,7 +511,7 @@
           <w:rFonts w:ascii="Times New Roman" w:hAnsi="Times New Roman" w:cs="Times New Roman"/>
         </w:rPr>
         <w:pict w14:anchorId="6E42E39E">
-          <v:rect id="_x0000_i1034" style="width:0;height:1.5pt" o:hralign="center" o:hrstd="t" o:hr="t" fillcolor="#a0a0a0" stroked="f"/>
+          <v:rect id="_x0000_i1035" style="width:0;height:1.5pt" o:hralign="center" o:hrstd="t" o:hr="t" fillcolor="#a0a0a0" stroked="f"/>
         </w:pict>
       </w:r>
     </w:p>
@@ -546,7 +602,7 @@
           <w:rFonts w:ascii="Times New Roman" w:hAnsi="Times New Roman" w:cs="Times New Roman"/>
         </w:rPr>
         <w:pict w14:anchorId="040B791D">
-          <v:rect id="_x0000_i1035" style="width:0;height:1.5pt" o:hralign="center" o:hrstd="t" o:hr="t" fillcolor="#a0a0a0" stroked="f"/>
+          <v:rect id="_x0000_i1036" style="width:0;height:1.5pt" o:hralign="center" o:hrstd="t" o:hr="t" fillcolor="#a0a0a0" stroked="f"/>
         </w:pict>
       </w:r>
     </w:p>
@@ -562,13 +618,16 @@
           <w:b/>
           <w:bCs/>
         </w:rPr>
-        <w:lastRenderedPageBreak/>
         <w:t>Limitations and Future Work</w:t>
       </w:r>
     </w:p>
     <w:p>
       <w:r>
-        <w:t>The greedy algorithm is inherently limited by its local decision-making strategy and may produce suboptimal global solutions if unrefined. The fatigue model is simplified as a flat resource metric and does not capture all complex physiological factors. Additionally, the scoring function relies on manually tuned weights, which may not generalize across all use cases. Future iterations of this project will transition from 'Flat Fatigue' optimization to Undulating Periodization models to map against real-world macrocycle planning (Fleck &amp; Kraemer, 2014).</w:t>
+        <w:t xml:space="preserve">The greedy algorithm is inherently limited by its local decision-making strategy and may produce suboptimal global solutions if unrefined. The fatigue model is simplified as a flat resource metric and does not capture all complex physiological factors. Additionally, the scoring function relies on manually tuned weights, which may not generalize across all use cases. Future iterations of this project will transition from 'Flat Fatigue' optimization </w:t>
+      </w:r>
+      <w:r>
+        <w:lastRenderedPageBreak/>
+        <w:t>to Undulating Periodization models to map against real-world macrocycle planning (Fleck &amp; Kraemer, 2014).</w:t>
       </w:r>
     </w:p>
     <w:p>
@@ -577,7 +636,7 @@
           <w:rFonts w:ascii="Times New Roman" w:hAnsi="Times New Roman" w:cs="Times New Roman"/>
         </w:rPr>
         <w:pict w14:anchorId="271810DB">
-          <v:rect id="_x0000_i1036" style="width:0;height:1.5pt" o:hralign="center" o:hrstd="t" o:hr="t" fillcolor="#a0a0a0" stroked="f"/>
+          <v:rect id="_x0000_i1037" style="width:0;height:1.5pt" o:hralign="center" o:hrstd="t" o:hr="t" fillcolor="#a0a0a0" stroked="f"/>
         </w:pict>
       </w:r>
     </w:p>
@@ -598,16 +657,14 @@
     </w:p>
     <w:p>
       <w:r>
-        <w:t>This project demonstrates how training program design can be formulated as a constrained optimization problem. The proposed system provides an efficient and interpretable framework for generating feasible schedules while balancing multiple objectives. The results establish a foundation for further refinement and analysis in subsequent phases.</w:t>
+        <w:t>By treating training as a resource-constrained optimization problem, AuraFit provides a robust solution to the complexities of human performance scheduling. The transition from greedy heuristics to evolutionary computation enables the model to satisfy multi-objective goals that are physically impossible to manage manually.</w:t>
       </w:r>
-    </w:p>
-    <w:p>
       <w:r>
         <w:rPr>
           <w:rFonts w:ascii="Times New Roman" w:hAnsi="Times New Roman" w:cs="Times New Roman"/>
         </w:rPr>
         <w:pict w14:anchorId="65751BD3">
-          <v:rect id="_x0000_i1043" style="width:0;height:1.5pt" o:hralign="center" o:hrstd="t" o:hr="t" fillcolor="#a0a0a0" stroked="f"/>
+          <v:rect id="_x0000_i1038" style="width:0;height:1.5pt" o:hralign="center" o:hrstd="t" o:hr="t" fillcolor="#a0a0a0" stroked="f"/>
         </w:pict>
       </w:r>
     </w:p>
@@ -624,7 +681,7 @@
           <w:noProof/>
         </w:rPr>
         <w:drawing>
-          <wp:anchor distT="0" distB="0" distL="114300" distR="114300" simplePos="0" relativeHeight="251659776" behindDoc="0" locked="0" layoutInCell="1" allowOverlap="1" wp14:anchorId="2A43CDA2" wp14:editId="5F3A27E2">
+          <wp:anchor distT="0" distB="0" distL="114300" distR="114300" simplePos="0" relativeHeight="251659776" behindDoc="0" locked="0" layoutInCell="1" allowOverlap="1" wp14:anchorId="2A43CDA2" wp14:editId="156F90B6">
             <wp:simplePos x="0" y="0"/>
             <wp:positionH relativeFrom="column">
               <wp:posOffset>-695325</wp:posOffset>
@@ -679,7 +736,7 @@
           <w:rFonts w:ascii="Times New Roman" w:hAnsi="Times New Roman" w:cs="Times New Roman"/>
         </w:rPr>
         <w:pict w14:anchorId="71421290">
-          <v:rect id="_x0000_i1042" style="width:0;height:1.5pt" o:hralign="center" o:bullet="t" o:hrstd="t" o:hr="t" fillcolor="#a0a0a0" stroked="f"/>
+          <v:rect id="_x0000_i1039" style="width:0;height:1.5pt" o:hralign="center" o:bullet="t" o:hrstd="t" o:hr="t" fillcolor="#a0a0a0" stroked="f"/>
         </w:pict>
       </w:r>
     </w:p>
@@ -888,6 +945,155 @@
       </w:rPr>
     </w:lvl>
   </w:abstractNum>
+  <w:abstractNum w:abstractNumId="9" w15:restartNumberingAfterBreak="0">
+    <w:nsid w:val="1F4F511A"/>
+    <w:multiLevelType w:val="multilevel"/>
+    <w:tmpl w:val="4C6C50E6"/>
+    <w:lvl w:ilvl="0">
+      <w:start w:val="1"/>
+      <w:numFmt w:val="bullet"/>
+      <w:lvlText w:val=""/>
+      <w:lvlJc w:val="left"/>
+      <w:pPr>
+        <w:tabs>
+          <w:tab w:val="num" w:pos="720"/>
+        </w:tabs>
+        <w:ind w:left="720" w:hanging="360"/>
+      </w:pPr>
+      <w:rPr>
+        <w:rFonts w:ascii="Symbol" w:hAnsi="Symbol" w:hint="default"/>
+        <w:sz w:val="20"/>
+      </w:rPr>
+    </w:lvl>
+    <w:lvl w:ilvl="1" w:tentative="1">
+      <w:start w:val="1"/>
+      <w:numFmt w:val="bullet"/>
+      <w:lvlText w:val="o"/>
+      <w:lvlJc w:val="left"/>
+      <w:pPr>
+        <w:tabs>
+          <w:tab w:val="num" w:pos="1440"/>
+        </w:tabs>
+        <w:ind w:left="1440" w:hanging="360"/>
+      </w:pPr>
+      <w:rPr>
+        <w:rFonts w:ascii="Courier New" w:hAnsi="Courier New" w:hint="default"/>
+        <w:sz w:val="20"/>
+      </w:rPr>
+    </w:lvl>
+    <w:lvl w:ilvl="2" w:tentative="1">
+      <w:start w:val="1"/>
+      <w:numFmt w:val="bullet"/>
+      <w:lvlText w:val=""/>
+      <w:lvlJc w:val="left"/>
+      <w:pPr>
+        <w:tabs>
+          <w:tab w:val="num" w:pos="2160"/>
+        </w:tabs>
+        <w:ind w:left="2160" w:hanging="360"/>
+      </w:pPr>
+      <w:rPr>
+        <w:rFonts w:ascii="Wingdings" w:hAnsi="Wingdings" w:hint="default"/>
+        <w:sz w:val="20"/>
+      </w:rPr>
+    </w:lvl>
+    <w:lvl w:ilvl="3" w:tentative="1">
+      <w:start w:val="1"/>
+      <w:numFmt w:val="bullet"/>
+      <w:lvlText w:val=""/>
+      <w:lvlJc w:val="left"/>
+      <w:pPr>
+        <w:tabs>
+          <w:tab w:val="num" w:pos="2880"/>
+        </w:tabs>
+        <w:ind w:left="2880" w:hanging="360"/>
+      </w:pPr>
+      <w:rPr>
+        <w:rFonts w:ascii="Wingdings" w:hAnsi="Wingdings" w:hint="default"/>
+        <w:sz w:val="20"/>
+      </w:rPr>
+    </w:lvl>
+    <w:lvl w:ilvl="4" w:tentative="1">
+      <w:start w:val="1"/>
+      <w:numFmt w:val="bullet"/>
+      <w:lvlText w:val=""/>
+      <w:lvlJc w:val="left"/>
+      <w:pPr>
+        <w:tabs>
+          <w:tab w:val="num" w:pos="3600"/>
+        </w:tabs>
+        <w:ind w:left="3600" w:hanging="360"/>
+      </w:pPr>
+      <w:rPr>
+        <w:rFonts w:ascii="Wingdings" w:hAnsi="Wingdings" w:hint="default"/>
+        <w:sz w:val="20"/>
+      </w:rPr>
+    </w:lvl>
+    <w:lvl w:ilvl="5" w:tentative="1">
+      <w:start w:val="1"/>
+      <w:numFmt w:val="bullet"/>
+      <w:lvlText w:val=""/>
+      <w:lvlJc w:val="left"/>
+      <w:pPr>
+        <w:tabs>
+          <w:tab w:val="num" w:pos="4320"/>
+        </w:tabs>
+        <w:ind w:left="4320" w:hanging="360"/>
+      </w:pPr>
+      <w:rPr>
+        <w:rFonts w:ascii="Wingdings" w:hAnsi="Wingdings" w:hint="default"/>
+        <w:sz w:val="20"/>
+      </w:rPr>
+    </w:lvl>
+    <w:lvl w:ilvl="6" w:tentative="1">
+      <w:start w:val="1"/>
+      <w:numFmt w:val="bullet"/>
+      <w:lvlText w:val=""/>
+      <w:lvlJc w:val="left"/>
+      <w:pPr>
+        <w:tabs>
+          <w:tab w:val="num" w:pos="5040"/>
+        </w:tabs>
+        <w:ind w:left="5040" w:hanging="360"/>
+      </w:pPr>
+      <w:rPr>
+        <w:rFonts w:ascii="Wingdings" w:hAnsi="Wingdings" w:hint="default"/>
+        <w:sz w:val="20"/>
+      </w:rPr>
+    </w:lvl>
+    <w:lvl w:ilvl="7" w:tentative="1">
+      <w:start w:val="1"/>
+      <w:numFmt w:val="bullet"/>
+      <w:lvlText w:val=""/>
+      <w:lvlJc w:val="left"/>
+      <w:pPr>
+        <w:tabs>
+          <w:tab w:val="num" w:pos="5760"/>
+        </w:tabs>
+        <w:ind w:left="5760" w:hanging="360"/>
+      </w:pPr>
+      <w:rPr>
+        <w:rFonts w:ascii="Wingdings" w:hAnsi="Wingdings" w:hint="default"/>
+        <w:sz w:val="20"/>
+      </w:rPr>
+    </w:lvl>
+    <w:lvl w:ilvl="8" w:tentative="1">
+      <w:start w:val="1"/>
+      <w:numFmt w:val="bullet"/>
+      <w:lvlText w:val=""/>
+      <w:lvlJc w:val="left"/>
+      <w:pPr>
+        <w:tabs>
+          <w:tab w:val="num" w:pos="6480"/>
+        </w:tabs>
+        <w:ind w:left="6480" w:hanging="360"/>
+      </w:pPr>
+      <w:rPr>
+        <w:rFonts w:ascii="Wingdings" w:hAnsi="Wingdings" w:hint="default"/>
+        <w:sz w:val="20"/>
+      </w:rPr>
+    </w:lvl>
+  </w:abstractNum>
   <w:num w:numId="1" w16cid:durableId="293340884">
     <w:abstractNumId w:val="8"/>
   </w:num>
@@ -914,6 +1120,9 @@
   </w:num>
   <w:num w:numId="9" w16cid:durableId="1858807282">
     <w:abstractNumId w:val="0"/>
+  </w:num>
+  <w:num w:numId="10" w16cid:durableId="69039843">
+    <w:abstractNumId w:val="9"/>
   </w:num>
 </w:numbering>
 </file>
@@ -1524,7 +1733,6 @@
   <w:style w:type="character" w:default="1" w:styleId="DefaultParagraphFont">
     <w:name w:val="Default Paragraph Font"/>
     <w:uiPriority w:val="1"/>
-    <w:semiHidden/>
     <w:unhideWhenUsed/>
   </w:style>
   <w:style w:type="table" w:default="1" w:styleId="TableNormal">
@@ -13067,7 +13275,7 @@
         <a:p>
           <a:r>
             <a:rPr lang="en-US"/>
-            <a:t>Input JSON</a:t>
+            <a:t>Input JSON/SQLite</a:t>
           </a:r>
         </a:p>
       </dgm:t>
@@ -13600,12 +13808,12 @@
         </a:fontRef>
       </dsp:style>
       <dsp:txBody>
-        <a:bodyPr spcFirstLastPara="0" vert="horz" wrap="square" lIns="34290" tIns="34290" rIns="34290" bIns="34290" numCol="1" spcCol="1270" anchor="ctr" anchorCtr="0">
+        <a:bodyPr spcFirstLastPara="0" vert="horz" wrap="square" lIns="26670" tIns="26670" rIns="26670" bIns="26670" numCol="1" spcCol="1270" anchor="ctr" anchorCtr="0">
           <a:noAutofit/>
         </a:bodyPr>
         <a:lstStyle/>
         <a:p>
-          <a:pPr marL="0" lvl="0" indent="0" algn="ctr" defTabSz="400050">
+          <a:pPr marL="0" lvl="0" indent="0" algn="ctr" defTabSz="311150">
             <a:lnSpc>
               <a:spcPct val="90000"/>
             </a:lnSpc>
@@ -13618,8 +13826,8 @@
             <a:buNone/>
           </a:pPr>
           <a:r>
-            <a:rPr lang="en-US" sz="900" kern="1200"/>
-            <a:t>Input JSON</a:t>
+            <a:rPr lang="en-US" sz="700" kern="1200"/>
+            <a:t>Input JSON/SQLite</a:t>
           </a:r>
         </a:p>
       </dsp:txBody>
@@ -13749,12 +13957,12 @@
         </a:fontRef>
       </dsp:style>
       <dsp:txBody>
-        <a:bodyPr spcFirstLastPara="0" vert="horz" wrap="square" lIns="34290" tIns="34290" rIns="34290" bIns="34290" numCol="1" spcCol="1270" anchor="ctr" anchorCtr="0">
+        <a:bodyPr spcFirstLastPara="0" vert="horz" wrap="square" lIns="26670" tIns="26670" rIns="26670" bIns="26670" numCol="1" spcCol="1270" anchor="ctr" anchorCtr="0">
           <a:noAutofit/>
         </a:bodyPr>
         <a:lstStyle/>
         <a:p>
-          <a:pPr marL="0" lvl="0" indent="0" algn="ctr" defTabSz="400050">
+          <a:pPr marL="0" lvl="0" indent="0" algn="ctr" defTabSz="311150">
             <a:lnSpc>
               <a:spcPct val="90000"/>
             </a:lnSpc>
@@ -13767,7 +13975,7 @@
             <a:buNone/>
           </a:pPr>
           <a:r>
-            <a:rPr lang="en-US" sz="900" kern="1200"/>
+            <a:rPr lang="en-US" sz="700" kern="1200"/>
             <a:t>Loader</a:t>
           </a:r>
         </a:p>
@@ -13898,12 +14106,12 @@
         </a:fontRef>
       </dsp:style>
       <dsp:txBody>
-        <a:bodyPr spcFirstLastPara="0" vert="horz" wrap="square" lIns="34290" tIns="34290" rIns="34290" bIns="34290" numCol="1" spcCol="1270" anchor="ctr" anchorCtr="0">
+        <a:bodyPr spcFirstLastPara="0" vert="horz" wrap="square" lIns="26670" tIns="26670" rIns="26670" bIns="26670" numCol="1" spcCol="1270" anchor="ctr" anchorCtr="0">
           <a:noAutofit/>
         </a:bodyPr>
         <a:lstStyle/>
         <a:p>
-          <a:pPr marL="0" lvl="0" indent="0" algn="ctr" defTabSz="400050">
+          <a:pPr marL="0" lvl="0" indent="0" algn="ctr" defTabSz="311150">
             <a:lnSpc>
               <a:spcPct val="90000"/>
             </a:lnSpc>
@@ -13916,7 +14124,7 @@
             <a:buNone/>
           </a:pPr>
           <a:r>
-            <a:rPr lang="en-US" sz="900" kern="1200"/>
+            <a:rPr lang="en-US" sz="700" kern="1200"/>
             <a:t>Models</a:t>
           </a:r>
         </a:p>
@@ -14047,12 +14255,12 @@
         </a:fontRef>
       </dsp:style>
       <dsp:txBody>
-        <a:bodyPr spcFirstLastPara="0" vert="horz" wrap="square" lIns="34290" tIns="34290" rIns="34290" bIns="34290" numCol="1" spcCol="1270" anchor="ctr" anchorCtr="0">
+        <a:bodyPr spcFirstLastPara="0" vert="horz" wrap="square" lIns="26670" tIns="26670" rIns="26670" bIns="26670" numCol="1" spcCol="1270" anchor="ctr" anchorCtr="0">
           <a:noAutofit/>
         </a:bodyPr>
         <a:lstStyle/>
         <a:p>
-          <a:pPr marL="0" lvl="0" indent="0" algn="ctr" defTabSz="400050">
+          <a:pPr marL="0" lvl="0" indent="0" algn="ctr" defTabSz="311150">
             <a:lnSpc>
               <a:spcPct val="90000"/>
             </a:lnSpc>
@@ -14065,7 +14273,7 @@
             <a:buNone/>
           </a:pPr>
           <a:r>
-            <a:rPr lang="en-US" sz="900" kern="1200"/>
+            <a:rPr lang="en-US" sz="700" kern="1200"/>
             <a:t>Filters</a:t>
           </a:r>
         </a:p>
@@ -14196,12 +14404,12 @@
         </a:fontRef>
       </dsp:style>
       <dsp:txBody>
-        <a:bodyPr spcFirstLastPara="0" vert="horz" wrap="square" lIns="34290" tIns="34290" rIns="34290" bIns="34290" numCol="1" spcCol="1270" anchor="ctr" anchorCtr="0">
+        <a:bodyPr spcFirstLastPara="0" vert="horz" wrap="square" lIns="26670" tIns="26670" rIns="26670" bIns="26670" numCol="1" spcCol="1270" anchor="ctr" anchorCtr="0">
           <a:noAutofit/>
         </a:bodyPr>
         <a:lstStyle/>
         <a:p>
-          <a:pPr marL="0" lvl="0" indent="0" algn="ctr" defTabSz="400050">
+          <a:pPr marL="0" lvl="0" indent="0" algn="ctr" defTabSz="311150">
             <a:lnSpc>
               <a:spcPct val="90000"/>
             </a:lnSpc>
@@ -14214,7 +14422,7 @@
             <a:buNone/>
           </a:pPr>
           <a:r>
-            <a:rPr lang="en-US" sz="900" kern="1200"/>
+            <a:rPr lang="en-US" sz="700" kern="1200"/>
             <a:t>Scoring</a:t>
           </a:r>
         </a:p>
@@ -14345,12 +14553,12 @@
         </a:fontRef>
       </dsp:style>
       <dsp:txBody>
-        <a:bodyPr spcFirstLastPara="0" vert="horz" wrap="square" lIns="34290" tIns="34290" rIns="34290" bIns="34290" numCol="1" spcCol="1270" anchor="ctr" anchorCtr="0">
+        <a:bodyPr spcFirstLastPara="0" vert="horz" wrap="square" lIns="26670" tIns="26670" rIns="26670" bIns="26670" numCol="1" spcCol="1270" anchor="ctr" anchorCtr="0">
           <a:noAutofit/>
         </a:bodyPr>
         <a:lstStyle/>
         <a:p>
-          <a:pPr marL="0" lvl="0" indent="0" algn="ctr" defTabSz="400050">
+          <a:pPr marL="0" lvl="0" indent="0" algn="ctr" defTabSz="311150">
             <a:lnSpc>
               <a:spcPct val="90000"/>
             </a:lnSpc>
@@ -14363,7 +14571,7 @@
             <a:buNone/>
           </a:pPr>
           <a:r>
-            <a:rPr lang="en-US" sz="900" kern="1200"/>
+            <a:rPr lang="en-US" sz="700" kern="1200"/>
             <a:t>Scheduler</a:t>
           </a:r>
         </a:p>
@@ -14494,12 +14702,12 @@
         </a:fontRef>
       </dsp:style>
       <dsp:txBody>
-        <a:bodyPr spcFirstLastPara="0" vert="horz" wrap="square" lIns="34290" tIns="34290" rIns="34290" bIns="34290" numCol="1" spcCol="1270" anchor="ctr" anchorCtr="0">
+        <a:bodyPr spcFirstLastPara="0" vert="horz" wrap="square" lIns="26670" tIns="26670" rIns="26670" bIns="26670" numCol="1" spcCol="1270" anchor="ctr" anchorCtr="0">
           <a:noAutofit/>
         </a:bodyPr>
         <a:lstStyle/>
         <a:p>
-          <a:pPr marL="0" lvl="0" indent="0" algn="ctr" defTabSz="400050">
+          <a:pPr marL="0" lvl="0" indent="0" algn="ctr" defTabSz="311150">
             <a:lnSpc>
               <a:spcPct val="90000"/>
             </a:lnSpc>
@@ -14512,7 +14720,7 @@
             <a:buNone/>
           </a:pPr>
           <a:r>
-            <a:rPr lang="en-US" sz="900" kern="1200"/>
+            <a:rPr lang="en-US" sz="700" kern="1200"/>
             <a:t>Evaluator</a:t>
           </a:r>
         </a:p>
@@ -14643,12 +14851,12 @@
         </a:fontRef>
       </dsp:style>
       <dsp:txBody>
-        <a:bodyPr spcFirstLastPara="0" vert="horz" wrap="square" lIns="34290" tIns="34290" rIns="34290" bIns="34290" numCol="1" spcCol="1270" anchor="ctr" anchorCtr="0">
+        <a:bodyPr spcFirstLastPara="0" vert="horz" wrap="square" lIns="26670" tIns="26670" rIns="26670" bIns="26670" numCol="1" spcCol="1270" anchor="ctr" anchorCtr="0">
           <a:noAutofit/>
         </a:bodyPr>
         <a:lstStyle/>
         <a:p>
-          <a:pPr marL="0" lvl="0" indent="0" algn="ctr" defTabSz="400050">
+          <a:pPr marL="0" lvl="0" indent="0" algn="ctr" defTabSz="311150">
             <a:lnSpc>
               <a:spcPct val="90000"/>
             </a:lnSpc>
@@ -14661,7 +14869,7 @@
             <a:buNone/>
           </a:pPr>
           <a:r>
-            <a:rPr lang="en-US" sz="900" kern="1200"/>
+            <a:rPr lang="en-US" sz="700" kern="1200"/>
             <a:t>Output</a:t>
           </a:r>
         </a:p>

</xml_diff>